<commit_message>
Add demo screenshots to feasibility report
</commit_message>
<xml_diff>
--- a/docs/research/2026-07-19-osdk-agent-trusted-data-space-feasibility.docx
+++ b/docs/research/2026-07-19-osdk-agent-trusted-data-space-feasibility.docx
@@ -4105,6 +4105,524 @@
           <w:sz w:val="20"/>
         </w:rPr>
         <w:t>增加 OpenTelemetry trace、结构化审计日志和交易计量事件。</w:t>
+      </w:r>
+    </w:p>
+    <w:p>
+      <w:pPr>
+        <w:pStyle w:val="Heading2"/>
+      </w:pPr>
+      <w:r>
+        <w:t>8.5 Demo 程序运行截图与说明</w:t>
+      </w:r>
+    </w:p>
+    <w:p>
+      <w:pPr>
+        <w:spacing w:after="100"/>
+      </w:pPr>
+      <w:r>
+        <w:rPr>
+          <w:rFonts w:ascii="Arial Unicode MS" w:hAnsi="Arial Unicode MS" w:eastAsia="Arial Unicode MS"/>
+          <w:sz w:val="20"/>
+        </w:rPr>
+        <w:t>以下截图来自当前本地运行的 Demo Console，用于说明报告中的机制不是静态概念图，而是已经在原型程序中形成了可交互的运行链路。</w:t>
+      </w:r>
+    </w:p>
+    <w:p>
+      <w:r>
+        <w:br w:type="page"/>
+      </w:r>
+    </w:p>
+    <w:p>
+      <w:pPr>
+        <w:keepNext/>
+        <w:spacing w:after="100"/>
+      </w:pPr>
+      <w:r>
+        <w:rPr>
+          <w:rFonts w:ascii="Arial Unicode MS" w:hAnsi="Arial Unicode MS" w:eastAsia="Arial Unicode MS"/>
+          <w:sz w:val="20"/>
+        </w:rPr>
+        <w:t>截图 1：Agent 价值闭环与企业用电征信工作台。</w:t>
+      </w:r>
+    </w:p>
+    <w:p>
+      <w:pPr>
+        <w:spacing w:after="100"/>
+      </w:pPr>
+      <w:r>
+        <w:rPr>
+          <w:rFonts w:ascii="Arial Unicode MS" w:hAnsi="Arial Unicode MS" w:eastAsia="Arial Unicode MS"/>
+          <w:sz w:val="20"/>
+        </w:rPr>
+        <w:t>页面顶部展示 Agent 价值闭环，左侧是前端查询工作台和动态本体内容，右侧是实时执行情况区域。用户只选择企业并发起产品动作，不接触底层 SQL、连接串或 Provider 表结构。</w:t>
+      </w:r>
+    </w:p>
+    <w:p>
+      <w:pPr>
+        <w:keepNext/>
+        <w:jc w:val="center"/>
+      </w:pPr>
+      <w:r>
+        <w:drawing>
+          <wp:inline xmlns:a="http://schemas.openxmlformats.org/drawingml/2006/main" xmlns:pic="http://schemas.openxmlformats.org/drawingml/2006/picture">
+            <wp:extent cx="6126480" cy="3914140"/>
+            <wp:docPr id="3" name="Picture 3"/>
+            <wp:cNvGraphicFramePr>
+              <a:graphicFrameLocks noChangeAspect="1"/>
+            </wp:cNvGraphicFramePr>
+            <a:graphic>
+              <a:graphicData uri="http://schemas.openxmlformats.org/drawingml/2006/picture">
+                <pic:pic>
+                  <pic:nvPicPr>
+                    <pic:cNvPr id="0" name="demo-01-power-workbench.png"/>
+                    <pic:cNvPicPr/>
+                  </pic:nvPicPr>
+                  <pic:blipFill>
+                    <a:blip r:embed="rId11"/>
+                    <a:stretch>
+                      <a:fillRect/>
+                    </a:stretch>
+                  </pic:blipFill>
+                  <pic:spPr>
+                    <a:xfrm>
+                      <a:off x="0" y="0"/>
+                      <a:ext cx="6126480" cy="3914140"/>
+                    </a:xfrm>
+                    <a:prstGeom prst="rect"/>
+                  </pic:spPr>
+                </pic:pic>
+              </a:graphicData>
+            </a:graphic>
+          </wp:inline>
+        </w:drawing>
+      </w:r>
+    </w:p>
+    <w:p>
+      <w:pPr>
+        <w:jc w:val="center"/>
+      </w:pPr>
+      <w:r>
+        <w:rPr>
+          <w:rFonts w:ascii="Arial Unicode MS" w:hAnsi="Arial Unicode MS" w:eastAsia="Arial Unicode MS"/>
+          <w:b/>
+          <w:sz w:val="18"/>
+        </w:rPr>
+        <w:t>Agent 价值闭环与企业用电征信工作台</w:t>
+      </w:r>
+    </w:p>
+    <w:p>
+      <w:r>
+        <w:br w:type="page"/>
+      </w:r>
+    </w:p>
+    <w:p>
+      <w:pPr>
+        <w:keepNext/>
+        <w:spacing w:after="100"/>
+      </w:pPr>
+      <w:r>
+        <w:rPr>
+          <w:rFonts w:ascii="Arial Unicode MS" w:hAnsi="Arial Unicode MS" w:eastAsia="Arial Unicode MS"/>
+          <w:sz w:val="20"/>
+        </w:rPr>
+        <w:t>截图 2：企业用电征信执行链路。</w:t>
+      </w:r>
+    </w:p>
+    <w:p>
+      <w:pPr>
+        <w:spacing w:after="100"/>
+      </w:pPr>
+      <w:r>
+        <w:rPr>
+          <w:rFonts w:ascii="Arial Unicode MS" w:hAnsi="Arial Unicode MS" w:eastAsia="Arial Unicode MS"/>
+          <w:sz w:val="20"/>
+        </w:rPr>
+        <w:t>点击“查询征信”后，右侧保留执行步骤，展示 Agent 接收意图、读取产品目录、申请授权、调用 Product OSDK、Provider Runtime 本地计算、返回结果和 Receipt 的全过程。</w:t>
+      </w:r>
+    </w:p>
+    <w:p>
+      <w:pPr>
+        <w:keepNext/>
+        <w:jc w:val="center"/>
+      </w:pPr>
+      <w:r>
+        <w:drawing>
+          <wp:inline xmlns:a="http://schemas.openxmlformats.org/drawingml/2006/main" xmlns:pic="http://schemas.openxmlformats.org/drawingml/2006/picture">
+            <wp:extent cx="6126480" cy="3914140"/>
+            <wp:docPr id="4" name="Picture 4"/>
+            <wp:cNvGraphicFramePr>
+              <a:graphicFrameLocks noChangeAspect="1"/>
+            </wp:cNvGraphicFramePr>
+            <a:graphic>
+              <a:graphicData uri="http://schemas.openxmlformats.org/drawingml/2006/picture">
+                <pic:pic>
+                  <pic:nvPicPr>
+                    <pic:cNvPr id="0" name="demo-02-power-execution.png"/>
+                    <pic:cNvPicPr/>
+                  </pic:nvPicPr>
+                  <pic:blipFill>
+                    <a:blip r:embed="rId12"/>
+                    <a:stretch>
+                      <a:fillRect/>
+                    </a:stretch>
+                  </pic:blipFill>
+                  <pic:spPr>
+                    <a:xfrm>
+                      <a:off x="0" y="0"/>
+                      <a:ext cx="6126480" cy="3914140"/>
+                    </a:xfrm>
+                    <a:prstGeom prst="rect"/>
+                  </pic:spPr>
+                </pic:pic>
+              </a:graphicData>
+            </a:graphic>
+          </wp:inline>
+        </w:drawing>
+      </w:r>
+    </w:p>
+    <w:p>
+      <w:pPr>
+        <w:jc w:val="center"/>
+      </w:pPr>
+      <w:r>
+        <w:rPr>
+          <w:rFonts w:ascii="Arial Unicode MS" w:hAnsi="Arial Unicode MS" w:eastAsia="Arial Unicode MS"/>
+          <w:b/>
+          <w:sz w:val="18"/>
+        </w:rPr>
+        <w:t>企业用电征信执行链路</w:t>
+      </w:r>
+    </w:p>
+    <w:p>
+      <w:r>
+        <w:br w:type="page"/>
+      </w:r>
+    </w:p>
+    <w:p>
+      <w:pPr>
+        <w:keepNext/>
+        <w:spacing w:after="100"/>
+      </w:pPr>
+      <w:r>
+        <w:rPr>
+          <w:rFonts w:ascii="Arial Unicode MS" w:hAnsi="Arial Unicode MS" w:eastAsia="Arial Unicode MS"/>
+          <w:sz w:val="20"/>
+        </w:rPr>
+        <w:t>截图 3：长春开挖风险产品。</w:t>
+      </w:r>
+    </w:p>
+    <w:p>
+      <w:pPr>
+        <w:spacing w:after="100"/>
+      </w:pPr>
+      <w:r>
+        <w:rPr>
+          <w:rFonts w:ascii="Arial Unicode MS" w:hAnsi="Arial Unicode MS" w:eastAsia="Arial Unicode MS"/>
+          <w:sz w:val="20"/>
+        </w:rPr>
+        <w:t>施工方只提交工程 ID、开挖深度和施工方式，Runtime 在长春数据域内使用管线坐标和规则进行风险评估，外部只得到风险等级、影响类型、建议和凭证，不暴露精确坐标。</w:t>
+      </w:r>
+    </w:p>
+    <w:p>
+      <w:pPr>
+        <w:keepNext/>
+        <w:jc w:val="center"/>
+      </w:pPr>
+      <w:r>
+        <w:drawing>
+          <wp:inline xmlns:a="http://schemas.openxmlformats.org/drawingml/2006/main" xmlns:pic="http://schemas.openxmlformats.org/drawingml/2006/picture">
+            <wp:extent cx="6126480" cy="3914140"/>
+            <wp:docPr id="5" name="Picture 5"/>
+            <wp:cNvGraphicFramePr>
+              <a:graphicFrameLocks noChangeAspect="1"/>
+            </wp:cNvGraphicFramePr>
+            <a:graphic>
+              <a:graphicData uri="http://schemas.openxmlformats.org/drawingml/2006/picture">
+                <pic:pic>
+                  <pic:nvPicPr>
+                    <pic:cNvPr id="0" name="demo-06-changchun-risk.png"/>
+                    <pic:cNvPicPr/>
+                  </pic:nvPicPr>
+                  <pic:blipFill>
+                    <a:blip r:embed="rId13"/>
+                    <a:stretch>
+                      <a:fillRect/>
+                    </a:stretch>
+                  </pic:blipFill>
+                  <pic:spPr>
+                    <a:xfrm>
+                      <a:off x="0" y="0"/>
+                      <a:ext cx="6126480" cy="3914140"/>
+                    </a:xfrm>
+                    <a:prstGeom prst="rect"/>
+                  </pic:spPr>
+                </pic:pic>
+              </a:graphicData>
+            </a:graphic>
+          </wp:inline>
+        </w:drawing>
+      </w:r>
+    </w:p>
+    <w:p>
+      <w:pPr>
+        <w:jc w:val="center"/>
+      </w:pPr>
+      <w:r>
+        <w:rPr>
+          <w:rFonts w:ascii="Arial Unicode MS" w:hAnsi="Arial Unicode MS" w:eastAsia="Arial Unicode MS"/>
+          <w:b/>
+          <w:sz w:val="18"/>
+        </w:rPr>
+        <w:t>长春开挖风险产品</w:t>
+      </w:r>
+    </w:p>
+    <w:p>
+      <w:r>
+        <w:br w:type="page"/>
+      </w:r>
+    </w:p>
+    <w:p>
+      <w:pPr>
+        <w:keepNext/>
+        <w:spacing w:after="100"/>
+      </w:pPr>
+      <w:r>
+        <w:rPr>
+          <w:rFonts w:ascii="Arial Unicode MS" w:hAnsi="Arial Unicode MS" w:eastAsia="Arial Unicode MS"/>
+          <w:sz w:val="20"/>
+        </w:rPr>
+        <w:t>截图 4：动态本体运维。</w:t>
+      </w:r>
+    </w:p>
+    <w:p>
+      <w:pPr>
+        <w:spacing w:after="100"/>
+      </w:pPr>
+      <w:r>
+        <w:rPr>
+          <w:rFonts w:ascii="Arial Unicode MS" w:hAnsi="Arial Unicode MS" w:eastAsia="Arial Unicode MS"/>
+          <w:sz w:val="20"/>
+        </w:rPr>
+        <w:t>该页面展示本体、产品投影、字段分类分级与 OSDK 生成结果。演示重点是：当分类分级变化后，Product Compiler 会重新生成产品接口，使 OSDK 暴露面随治理规则收缩。</w:t>
+      </w:r>
+    </w:p>
+    <w:p>
+      <w:pPr>
+        <w:keepNext/>
+        <w:jc w:val="center"/>
+      </w:pPr>
+      <w:r>
+        <w:drawing>
+          <wp:inline xmlns:a="http://schemas.openxmlformats.org/drawingml/2006/main" xmlns:pic="http://schemas.openxmlformats.org/drawingml/2006/picture">
+            <wp:extent cx="6126480" cy="3914140"/>
+            <wp:docPr id="6" name="Picture 6"/>
+            <wp:cNvGraphicFramePr>
+              <a:graphicFrameLocks noChangeAspect="1"/>
+            </wp:cNvGraphicFramePr>
+            <a:graphic>
+              <a:graphicData uri="http://schemas.openxmlformats.org/drawingml/2006/picture">
+                <pic:pic>
+                  <pic:nvPicPr>
+                    <pic:cNvPr id="0" name="demo-03-ontology-ops.png"/>
+                    <pic:cNvPicPr/>
+                  </pic:nvPicPr>
+                  <pic:blipFill>
+                    <a:blip r:embed="rId14"/>
+                    <a:stretch>
+                      <a:fillRect/>
+                    </a:stretch>
+                  </pic:blipFill>
+                  <pic:spPr>
+                    <a:xfrm>
+                      <a:off x="0" y="0"/>
+                      <a:ext cx="6126480" cy="3914140"/>
+                    </a:xfrm>
+                    <a:prstGeom prst="rect"/>
+                  </pic:spPr>
+                </pic:pic>
+              </a:graphicData>
+            </a:graphic>
+          </wp:inline>
+        </w:drawing>
+      </w:r>
+    </w:p>
+    <w:p>
+      <w:pPr>
+        <w:jc w:val="center"/>
+      </w:pPr>
+      <w:r>
+        <w:rPr>
+          <w:rFonts w:ascii="Arial Unicode MS" w:hAnsi="Arial Unicode MS" w:eastAsia="Arial Unicode MS"/>
+          <w:b/>
+          <w:sz w:val="18"/>
+        </w:rPr>
+        <w:t>动态本体运维</w:t>
+      </w:r>
+    </w:p>
+    <w:p>
+      <w:r>
+        <w:br w:type="page"/>
+      </w:r>
+    </w:p>
+    <w:p>
+      <w:pPr>
+        <w:keepNext/>
+        <w:spacing w:after="100"/>
+      </w:pPr>
+      <w:r>
+        <w:rPr>
+          <w:rFonts w:ascii="Arial Unicode MS" w:hAnsi="Arial Unicode MS" w:eastAsia="Arial Unicode MS"/>
+          <w:sz w:val="20"/>
+        </w:rPr>
+        <w:t>截图 5：远程 OSDK 部署视图。</w:t>
+      </w:r>
+    </w:p>
+    <w:p>
+      <w:pPr>
+        <w:spacing w:after="100"/>
+      </w:pPr>
+      <w:r>
+        <w:rPr>
+          <w:rFonts w:ascii="Arial Unicode MS" w:hAnsi="Arial Unicode MS" w:eastAsia="Arial Unicode MS"/>
+          <w:sz w:val="20"/>
+        </w:rPr>
+        <w:t>该页面展示客户侧 OSDK workload、可信数据空间网关、我方 Product Runtime、Receipt 与联合计算扩展之间的信任边界，并给出实际调用代码和受控请求 envelope。</w:t>
+      </w:r>
+    </w:p>
+    <w:p>
+      <w:pPr>
+        <w:keepNext/>
+        <w:jc w:val="center"/>
+      </w:pPr>
+      <w:r>
+        <w:drawing>
+          <wp:inline xmlns:a="http://schemas.openxmlformats.org/drawingml/2006/main" xmlns:pic="http://schemas.openxmlformats.org/drawingml/2006/picture">
+            <wp:extent cx="6126480" cy="3914140"/>
+            <wp:docPr id="7" name="Picture 7"/>
+            <wp:cNvGraphicFramePr>
+              <a:graphicFrameLocks noChangeAspect="1"/>
+            </wp:cNvGraphicFramePr>
+            <a:graphic>
+              <a:graphicData uri="http://schemas.openxmlformats.org/drawingml/2006/picture">
+                <pic:pic>
+                  <pic:nvPicPr>
+                    <pic:cNvPr id="0" name="demo-04-deployment-view.png"/>
+                    <pic:cNvPicPr/>
+                  </pic:nvPicPr>
+                  <pic:blipFill>
+                    <a:blip r:embed="rId15"/>
+                    <a:stretch>
+                      <a:fillRect/>
+                    </a:stretch>
+                  </pic:blipFill>
+                  <pic:spPr>
+                    <a:xfrm>
+                      <a:off x="0" y="0"/>
+                      <a:ext cx="6126480" cy="3914140"/>
+                    </a:xfrm>
+                    <a:prstGeom prst="rect"/>
+                  </pic:spPr>
+                </pic:pic>
+              </a:graphicData>
+            </a:graphic>
+          </wp:inline>
+        </w:drawing>
+      </w:r>
+    </w:p>
+    <w:p>
+      <w:pPr>
+        <w:jc w:val="center"/>
+      </w:pPr>
+      <w:r>
+        <w:rPr>
+          <w:rFonts w:ascii="Arial Unicode MS" w:hAnsi="Arial Unicode MS" w:eastAsia="Arial Unicode MS"/>
+          <w:b/>
+          <w:sz w:val="18"/>
+        </w:rPr>
+        <w:t>远程 OSDK 部署视图</w:t>
+      </w:r>
+    </w:p>
+    <w:p>
+      <w:r>
+        <w:br w:type="page"/>
+      </w:r>
+    </w:p>
+    <w:p>
+      <w:pPr>
+        <w:keepNext/>
+        <w:spacing w:after="100"/>
+      </w:pPr>
+      <w:r>
+        <w:rPr>
+          <w:rFonts w:ascii="Arial Unicode MS" w:hAnsi="Arial Unicode MS" w:eastAsia="Arial Unicode MS"/>
+          <w:sz w:val="20"/>
+        </w:rPr>
+        <w:t>截图 6：远程 OSDK 经 Gateway 调用后的结果。</w:t>
+      </w:r>
+    </w:p>
+    <w:p>
+      <w:pPr>
+        <w:spacing w:after="100"/>
+      </w:pPr>
+      <w:r>
+        <w:rPr>
+          <w:rFonts w:ascii="Arial Unicode MS" w:hAnsi="Arial Unicode MS" w:eastAsia="Arial Unicode MS"/>
+          <w:sz w:val="20"/>
+        </w:rPr>
+        <w:t>点击“模拟网关调用”后，页面展示 succeeded 网关状态、征信评分、Receipt 编号，以及右侧 Gateway 校验身份、产品契约、action 参数、授权和路由的执行明细。</w:t>
+      </w:r>
+    </w:p>
+    <w:p>
+      <w:pPr>
+        <w:keepNext/>
+        <w:jc w:val="center"/>
+      </w:pPr>
+      <w:r>
+        <w:drawing>
+          <wp:inline xmlns:a="http://schemas.openxmlformats.org/drawingml/2006/main" xmlns:pic="http://schemas.openxmlformats.org/drawingml/2006/picture">
+            <wp:extent cx="6126480" cy="3914140"/>
+            <wp:docPr id="8" name="Picture 8"/>
+            <wp:cNvGraphicFramePr>
+              <a:graphicFrameLocks noChangeAspect="1"/>
+            </wp:cNvGraphicFramePr>
+            <a:graphic>
+              <a:graphicData uri="http://schemas.openxmlformats.org/drawingml/2006/picture">
+                <pic:pic>
+                  <pic:nvPicPr>
+                    <pic:cNvPr id="0" name="demo-05-gateway-result.png"/>
+                    <pic:cNvPicPr/>
+                  </pic:nvPicPr>
+                  <pic:blipFill>
+                    <a:blip r:embed="rId16"/>
+                    <a:stretch>
+                      <a:fillRect/>
+                    </a:stretch>
+                  </pic:blipFill>
+                  <pic:spPr>
+                    <a:xfrm>
+                      <a:off x="0" y="0"/>
+                      <a:ext cx="6126480" cy="3914140"/>
+                    </a:xfrm>
+                    <a:prstGeom prst="rect"/>
+                  </pic:spPr>
+                </pic:pic>
+              </a:graphicData>
+            </a:graphic>
+          </wp:inline>
+        </w:drawing>
+      </w:r>
+    </w:p>
+    <w:p>
+      <w:pPr>
+        <w:jc w:val="center"/>
+      </w:pPr>
+      <w:r>
+        <w:rPr>
+          <w:rFonts w:ascii="Arial Unicode MS" w:hAnsi="Arial Unicode MS" w:eastAsia="Arial Unicode MS"/>
+          <w:b/>
+          <w:sz w:val="18"/>
+        </w:rPr>
+        <w:t>远程 OSDK 经 Gateway 调用后的结果</w:t>
       </w:r>
     </w:p>
     <w:p>
@@ -4787,7 +5305,7 @@
         <w:drawing>
           <wp:inline xmlns:a="http://schemas.openxmlformats.org/drawingml/2006/main" xmlns:pic="http://schemas.openxmlformats.org/drawingml/2006/picture">
             <wp:extent cx="4209572" cy="7863840"/>
-            <wp:docPr id="3" name="Picture 3"/>
+            <wp:docPr id="9" name="Picture 9"/>
             <wp:cNvGraphicFramePr>
               <a:graphicFrameLocks noChangeAspect="1"/>
             </wp:cNvGraphicFramePr>
@@ -4799,7 +5317,7 @@
                     <pic:cNvPicPr/>
                   </pic:nvPicPr>
                   <pic:blipFill>
-                    <a:blip r:embed="rId11"/>
+                    <a:blip r:embed="rId17"/>
                     <a:stretch>
                       <a:fillRect/>
                     </a:stretch>
@@ -6805,7 +7323,7 @@
         <w:drawing>
           <wp:inline xmlns:a="http://schemas.openxmlformats.org/drawingml/2006/main" xmlns:pic="http://schemas.openxmlformats.org/drawingml/2006/picture">
             <wp:extent cx="6035040" cy="1487707"/>
-            <wp:docPr id="4" name="Picture 4"/>
+            <wp:docPr id="10" name="Picture 10"/>
             <wp:cNvGraphicFramePr>
               <a:graphicFrameLocks noChangeAspect="1"/>
             </wp:cNvGraphicFramePr>
@@ -6817,7 +7335,7 @@
                     <pic:cNvPicPr/>
                   </pic:nvPicPr>
                   <pic:blipFill>
-                    <a:blip r:embed="rId12"/>
+                    <a:blip r:embed="rId18"/>
                     <a:stretch>
                       <a:fillRect/>
                     </a:stretch>

</xml_diff>